<commit_message>
Update author name in executive report for clarity
</commit_message>
<xml_diff>
--- a/Informe_Ejecutivo_Derivados.docx
+++ b/Informe_Ejecutivo_Derivados.docx
@@ -1,6 +1,6 @@
 
 <file path=word/document.xml><?xml version="1.0" encoding="utf-8"?>
-<w:document xmlns:wpc="http://schemas.microsoft.com/office/word/2010/wordprocessingCanvas" xmlns:cx="http://schemas.microsoft.com/office/drawing/2014/chartex" xmlns:cx1="http://schemas.microsoft.com/office/drawing/2015/9/8/chartex" xmlns:cx2="http://schemas.microsoft.com/office/drawing/2015/10/21/chartex" xmlns:cx3="http://schemas.microsoft.com/office/drawing/2016/5/9/chartex" xmlns:cx4="http://schemas.microsoft.com/office/drawing/2016/5/10/chartex" xmlns:cx5="http://schemas.microsoft.com/office/drawing/2016/5/11/chartex" xmlns:cx6="http://schemas.microsoft.com/office/drawing/2016/5/12/chartex" xmlns:cx7="http://schemas.microsoft.com/office/drawing/2016/5/13/chartex" xmlns:cx8="http://schemas.microsoft.com/office/drawing/2016/5/14/chartex" xmlns:mc="http://schemas.openxmlformats.org/markup-compatibility/2006" xmlns:aink="http://schemas.microsoft.com/office/drawing/2016/ink" xmlns:am3d="http://schemas.microsoft.com/office/drawing/2017/model3d" xmlns:o="urn:schemas-microsoft-com:office:office" xmlns:r="http://schemas.openxmlformats.org/officeDocument/2006/relationships" xmlns:m="http://schemas.openxmlformats.org/officeDocument/2006/math" xmlns:v="urn:schemas-microsoft-com:vml" xmlns:wp14="http://schemas.microsoft.com/office/word/2010/wordprocessingDrawing" xmlns:wp="http://schemas.openxmlformats.org/drawingml/2006/wordprocessingDrawing" xmlns:w10="urn:schemas-microsoft-com:office:word" xmlns:w="http://schemas.openxmlformats.org/wordprocessingml/2006/main" xmlns:w14="http://schemas.microsoft.com/office/word/2010/wordml" xmlns:w15="http://schemas.microsoft.com/office/word/2012/wordml" xmlns:w16cid="http://schemas.microsoft.com/office/word/2016/wordml/cid" xmlns:w16se="http://schemas.microsoft.com/office/word/2015/wordml/symex" xmlns:wpg="http://schemas.microsoft.com/office/word/2010/wordprocessingGroup" xmlns:wpi="http://schemas.microsoft.com/office/word/2010/wordprocessingInk" xmlns:wne="http://schemas.microsoft.com/office/word/2006/wordml" xmlns:wps="http://schemas.microsoft.com/office/word/2010/wordprocessingShape" mc:Ignorable="w14 w15 w16se w16cid wp14">
+<w:document xmlns:wpc="http://schemas.microsoft.com/office/word/2010/wordprocessingCanvas" xmlns:cx="http://schemas.microsoft.com/office/drawing/2014/chartex" xmlns:cx1="http://schemas.microsoft.com/office/drawing/2015/9/8/chartex" xmlns:cx2="http://schemas.microsoft.com/office/drawing/2015/10/21/chartex" xmlns:cx3="http://schemas.microsoft.com/office/drawing/2016/5/9/chartex" xmlns:cx4="http://schemas.microsoft.com/office/drawing/2016/5/10/chartex" xmlns:cx5="http://schemas.microsoft.com/office/drawing/2016/5/11/chartex" xmlns:cx6="http://schemas.microsoft.com/office/drawing/2016/5/12/chartex" xmlns:cx7="http://schemas.microsoft.com/office/drawing/2016/5/13/chartex" xmlns:cx8="http://schemas.microsoft.com/office/drawing/2016/5/14/chartex" xmlns:mc="http://schemas.openxmlformats.org/markup-compatibility/2006" xmlns:aink="http://schemas.microsoft.com/office/drawing/2016/ink" xmlns:am3d="http://schemas.microsoft.com/office/drawing/2017/model3d" xmlns:o="urn:schemas-microsoft-com:office:office" xmlns:oel="http://schemas.microsoft.com/office/2019/extlst" xmlns:r="http://schemas.openxmlformats.org/officeDocument/2006/relationships" xmlns:m="http://schemas.openxmlformats.org/officeDocument/2006/math" xmlns:v="urn:schemas-microsoft-com:vml" xmlns:wp14="http://schemas.microsoft.com/office/word/2010/wordprocessingDrawing" xmlns:wp="http://schemas.openxmlformats.org/drawingml/2006/wordprocessingDrawing" xmlns:w10="urn:schemas-microsoft-com:office:word" xmlns:w="http://schemas.openxmlformats.org/wordprocessingml/2006/main" xmlns:w14="http://schemas.microsoft.com/office/word/2010/wordml" xmlns:w15="http://schemas.microsoft.com/office/word/2012/wordml" xmlns:w16cex="http://schemas.microsoft.com/office/word/2018/wordml/cex" xmlns:w16cid="http://schemas.microsoft.com/office/word/2016/wordml/cid" xmlns:w16="http://schemas.microsoft.com/office/word/2018/wordml" xmlns:w16du="http://schemas.microsoft.com/office/word/2023/wordml/word16du" xmlns:w16sdtdh="http://schemas.microsoft.com/office/word/2020/wordml/sdtdatahash" xmlns:w16sdtfl="http://schemas.microsoft.com/office/word/2024/wordml/sdtformatlock" xmlns:w16se="http://schemas.microsoft.com/office/word/2015/wordml/symex" xmlns:wpg="http://schemas.microsoft.com/office/word/2010/wordprocessingGroup" xmlns:wpi="http://schemas.microsoft.com/office/word/2010/wordprocessingInk" xmlns:wne="http://schemas.microsoft.com/office/word/2006/wordml" xmlns:wps="http://schemas.microsoft.com/office/word/2010/wordprocessingShape" mc:Ignorable="w14 w15 w16se w16cid w16 w16cex w16sdtdh w16sdtfl w16du wp14">
   <w:body>
     <w:sdt>
       <w:sdtPr>
@@ -386,7 +386,7 @@
                     <v:stroke joinstyle="miter"/>
                     <v:path gradientshapeok="t" o:connecttype="rect"/>
                   </v:shapetype>
-                  <v:shape id="Cuadro de texto 152" o:spid="_x0000_s1026" type="#_x0000_t202" style="position:absolute;margin-left:0;margin-top:0;width:8in;height:1in;z-index:251660288;visibility:visible;mso-wrap-style:square;mso-width-percent:941;mso-height-percent:92;mso-top-percent:818;mso-wrap-distance-left:9pt;mso-wrap-distance-top:0;mso-wrap-distance-right:9pt;mso-wrap-distance-bottom:0;mso-position-horizontal:center;mso-position-horizontal-relative:page;mso-position-vertical-relative:page;mso-width-percent:941;mso-height-percent:92;mso-top-percent:818;mso-width-relative:page;mso-height-relative:page;v-text-anchor:bottom" o:gfxdata="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" filled="f" stroked="f" strokeweight=".5pt">
+                  <v:shape id="Cuadro de texto 152" o:spid="_x0000_s1026" type="#_x0000_t202" style="position:absolute;margin-left:0;margin-top:0;width:8in;height:1in;z-index:251660288;visibility:visible;mso-wrap-style:square;mso-width-percent:941;mso-height-percent:92;mso-top-percent:818;mso-wrap-distance-left:9pt;mso-wrap-distance-top:0;mso-wrap-distance-right:9pt;mso-wrap-distance-bottom:0;mso-position-horizontal:center;mso-position-horizontal-relative:page;mso-position-vertical-relative:page;mso-width-percent:941;mso-height-percent:92;mso-top-percent:818;mso-width-relative:page;mso-height-relative:page;v-text-anchor:bottom" o:gfxdata="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" filled="f" stroked="f" strokeweight=".5pt">
                     <v:textbox inset="126pt,0,54pt,0">
                       <w:txbxContent>
                         <w:p>
@@ -507,6 +507,7 @@
                                   <w:dataBinding w:prefixMappings="xmlns:ns0='http://schemas.microsoft.com/office/2006/coverPageProps' " w:xpath="/ns0:CoverPageProperties[1]/ns0:Abstract[1]" w:storeItemID="{55AF091B-3C7A-41E3-B477-F2FDAA23CFDA}"/>
                                   <w:text w:multiLine="1"/>
                                 </w:sdtPr>
+                                <w:sdtEndPr/>
                                 <w:sdtContent>
                                   <w:p>
                                     <w:pPr>
@@ -536,14 +537,6 @@
                                         <w:szCs w:val="20"/>
                                       </w:rPr>
                                       <w:br/>
-                                    </w:r>
-                                    <w:r>
-                                      <w:rPr>
-                                        <w:rFonts w:ascii="Arial" w:hAnsi="Arial" w:cs="Arial"/>
-                                        <w:color w:val="595959" w:themeColor="text1" w:themeTint="A6"/>
-                                        <w:sz w:val="20"/>
-                                        <w:szCs w:val="20"/>
-                                      </w:rPr>
                                       <w:t>Análisis de riesgo, valoración, simulación y eficiencia de las coberturas para un horizonte de inversión de dos años.</w:t>
                                     </w:r>
                                   </w:p>
@@ -571,7 +564,7 @@
               </mc:Choice>
               <mc:Fallback>
                 <w:pict>
-                  <v:shape w14:anchorId="62A6B01C" id="Cuadro de texto 153" o:spid="_x0000_s1027" type="#_x0000_t202" style="position:absolute;margin-left:0;margin-top:0;width:8in;height:79.5pt;z-index:251661312;visibility:visible;mso-wrap-style:square;mso-width-percent:941;mso-height-percent:100;mso-top-percent:700;mso-wrap-distance-left:9pt;mso-wrap-distance-top:0;mso-wrap-distance-right:9pt;mso-wrap-distance-bottom:0;mso-position-horizontal:center;mso-position-horizontal-relative:page;mso-position-vertical-relative:page;mso-width-percent:941;mso-height-percent:100;mso-top-percent:700;mso-width-relative:page;mso-height-relative:page;v-text-anchor:top" o:gfxdata="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" filled="f" stroked="f" strokeweight=".5pt">
+                  <v:shape w14:anchorId="62A6B01C" id="Cuadro de texto 153" o:spid="_x0000_s1027" type="#_x0000_t202" style="position:absolute;margin-left:0;margin-top:0;width:8in;height:79.5pt;z-index:251661312;visibility:visible;mso-wrap-style:square;mso-width-percent:941;mso-height-percent:100;mso-top-percent:700;mso-wrap-distance-left:9pt;mso-wrap-distance-top:0;mso-wrap-distance-right:9pt;mso-wrap-distance-bottom:0;mso-position-horizontal:center;mso-position-horizontal-relative:page;mso-position-vertical-relative:page;mso-width-percent:941;mso-height-percent:100;mso-top-percent:700;mso-width-relative:page;mso-height-relative:page;v-text-anchor:top" o:gfxdata="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" filled="f" stroked="f" strokeweight=".5pt">
                     <v:textbox style="mso-fit-shape-to-text:t" inset="126pt,0,54pt,0">
                       <w:txbxContent>
                         <w:p>
@@ -610,6 +603,7 @@
                             <w:dataBinding w:prefixMappings="xmlns:ns0='http://schemas.microsoft.com/office/2006/coverPageProps' " w:xpath="/ns0:CoverPageProperties[1]/ns0:Abstract[1]" w:storeItemID="{55AF091B-3C7A-41E3-B477-F2FDAA23CFDA}"/>
                             <w:text w:multiLine="1"/>
                           </w:sdtPr>
+                          <w:sdtEndPr/>
                           <w:sdtContent>
                             <w:p>
                               <w:pPr>
@@ -639,14 +633,6 @@
                                   <w:szCs w:val="20"/>
                                 </w:rPr>
                                 <w:br/>
-                              </w:r>
-                              <w:r>
-                                <w:rPr>
-                                  <w:rFonts w:ascii="Arial" w:hAnsi="Arial" w:cs="Arial"/>
-                                  <w:color w:val="595959" w:themeColor="text1" w:themeTint="A6"/>
-                                  <w:sz w:val="20"/>
-                                  <w:szCs w:val="20"/>
-                                </w:rPr>
                                 <w:t>Análisis de riesgo, valoración, simulación y eficiencia de las coberturas para un horizonte de inversión de dos años.</w:t>
                               </w:r>
                             </w:p>
@@ -748,6 +734,7 @@
                                     <w:dataBinding w:prefixMappings="xmlns:ns0='http://purl.org/dc/elements/1.1/' xmlns:ns1='http://schemas.openxmlformats.org/package/2006/metadata/core-properties' " w:xpath="/ns1:coreProperties[1]/ns0:title[1]" w:storeItemID="{6C3C8BC8-F283-45AE-878A-BAB7291924A1}"/>
                                     <w:text w:multiLine="1"/>
                                   </w:sdtPr>
+                                  <w:sdtEndPr/>
                                   <w:sdtContent>
                                     <w:r>
                                       <w:rPr>
@@ -776,6 +763,7 @@
                                   <w:dataBinding w:prefixMappings="xmlns:ns0='http://purl.org/dc/elements/1.1/' xmlns:ns1='http://schemas.openxmlformats.org/package/2006/metadata/core-properties' " w:xpath="/ns1:coreProperties[1]/ns0:subject[1]" w:storeItemID="{6C3C8BC8-F283-45AE-878A-BAB7291924A1}"/>
                                   <w:text/>
                                 </w:sdtPr>
+                                <w:sdtEndPr/>
                                 <w:sdtContent>
                                   <w:p>
                                     <w:pPr>
@@ -820,7 +808,7 @@
               </mc:Choice>
               <mc:Fallback>
                 <w:pict>
-                  <v:shape w14:anchorId="4D891FBF" id="Cuadro de texto 154" o:spid="_x0000_s1028" type="#_x0000_t202" style="position:absolute;margin-left:0;margin-top:0;width:8in;height:286.5pt;z-index:251659264;visibility:visible;mso-wrap-style:square;mso-width-percent:941;mso-height-percent:363;mso-top-percent:300;mso-wrap-distance-left:9pt;mso-wrap-distance-top:0;mso-wrap-distance-right:9pt;mso-wrap-distance-bottom:0;mso-position-horizontal:center;mso-position-horizontal-relative:page;mso-position-vertical-relative:page;mso-width-percent:941;mso-height-percent:363;mso-top-percent:300;mso-width-relative:page;mso-height-relative:page;v-text-anchor:bottom" o:gfxdata="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" filled="f" stroked="f" strokeweight=".5pt">
+                  <v:shape w14:anchorId="4D891FBF" id="Cuadro de texto 154" o:spid="_x0000_s1028" type="#_x0000_t202" style="position:absolute;margin-left:0;margin-top:0;width:8in;height:286.5pt;z-index:251659264;visibility:visible;mso-wrap-style:square;mso-width-percent:941;mso-height-percent:363;mso-top-percent:300;mso-wrap-distance-left:9pt;mso-wrap-distance-top:0;mso-wrap-distance-right:9pt;mso-wrap-distance-bottom:0;mso-position-horizontal:center;mso-position-horizontal-relative:page;mso-position-vertical-relative:page;mso-width-percent:941;mso-height-percent:363;mso-top-percent:300;mso-width-relative:page;mso-height-relative:page;v-text-anchor:bottom" o:gfxdata="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" filled="f" stroked="f" strokeweight=".5pt">
                     <v:textbox inset="126pt,0,54pt,0">
                       <w:txbxContent>
                         <w:p>
@@ -848,6 +836,7 @@
                               <w:dataBinding w:prefixMappings="xmlns:ns0='http://purl.org/dc/elements/1.1/' xmlns:ns1='http://schemas.openxmlformats.org/package/2006/metadata/core-properties' " w:xpath="/ns1:coreProperties[1]/ns0:title[1]" w:storeItemID="{6C3C8BC8-F283-45AE-878A-BAB7291924A1}"/>
                               <w:text w:multiLine="1"/>
                             </w:sdtPr>
+                            <w:sdtEndPr/>
                             <w:sdtContent>
                               <w:r>
                                 <w:rPr>
@@ -876,6 +865,7 @@
                             <w:dataBinding w:prefixMappings="xmlns:ns0='http://purl.org/dc/elements/1.1/' xmlns:ns1='http://schemas.openxmlformats.org/package/2006/metadata/core-properties' " w:xpath="/ns1:coreProperties[1]/ns0:subject[1]" w:storeItemID="{6C3C8BC8-F283-45AE-878A-BAB7291924A1}"/>
                             <w:text/>
                           </w:sdtPr>
+                          <w:sdtEndPr/>
                           <w:sdtContent>
                             <w:p>
                               <w:pPr>
@@ -977,6 +967,24 @@
                                   </w:rPr>
                                   <w:t>Juan</w:t>
                                 </w:r>
+                                <w:r>
+                                  <w:rPr>
+                                    <w:rFonts w:ascii="Arial" w:hAnsi="Arial" w:cs="Arial"/>
+                                    <w:color w:val="595959" w:themeColor="text1" w:themeTint="A6"/>
+                                    <w:sz w:val="20"/>
+                                    <w:szCs w:val="20"/>
+                                  </w:rPr>
+                                  <w:t xml:space="preserve"> Pablo Quintero </w:t>
+                                </w:r>
+                                <w:r>
+                                  <w:rPr>
+                                    <w:rFonts w:ascii="Arial" w:hAnsi="Arial" w:cs="Arial"/>
+                                    <w:color w:val="595959" w:themeColor="text1" w:themeTint="A6"/>
+                                    <w:sz w:val="20"/>
+                                    <w:szCs w:val="20"/>
+                                  </w:rPr>
+                                  <w:t>Rivera</w:t>
+                                </w:r>
                               </w:p>
                               <w:p>
                                 <w:pPr>
@@ -1036,7 +1044,7 @@
               </mc:Choice>
               <mc:Fallback>
                 <w:pict>
-                  <v:shape w14:anchorId="7BD9E1B6" id="Cuadro de texto 1" o:spid="_x0000_s1029" type="#_x0000_t202" style="position:absolute;margin-left:283.95pt;margin-top:549.65pt;width:170.5pt;height:50pt;z-index:251663360;visibility:visible;mso-wrap-style:square;mso-wrap-distance-left:9pt;mso-wrap-distance-top:0;mso-wrap-distance-right:9pt;mso-wrap-distance-bottom:0;mso-position-horizontal:absolute;mso-position-horizontal-relative:text;mso-position-vertical:absolute;mso-position-vertical-relative:text;v-text-anchor:top" o:gfxdata="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" fillcolor="white [3201]" stroked="f" strokeweight=".5pt">
+                  <v:shape w14:anchorId="7BD9E1B6" id="Cuadro de texto 1" o:spid="_x0000_s1029" type="#_x0000_t202" style="position:absolute;margin-left:283.95pt;margin-top:549.65pt;width:170.5pt;height:50pt;z-index:251663360;visibility:visible;mso-wrap-style:square;mso-wrap-distance-left:9pt;mso-wrap-distance-top:0;mso-wrap-distance-right:9pt;mso-wrap-distance-bottom:0;mso-position-horizontal:absolute;mso-position-horizontal-relative:text;mso-position-vertical:absolute;mso-position-vertical-relative:text;v-text-anchor:top" o:gfxdata="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" fillcolor="white [3201]" stroked="f" strokeweight=".5pt">
                     <v:textbox>
                       <w:txbxContent>
                         <w:p>
@@ -1058,6 +1066,24 @@
                               <w:szCs w:val="20"/>
                             </w:rPr>
                             <w:t>Juan</w:t>
+                          </w:r>
+                          <w:r>
+                            <w:rPr>
+                              <w:rFonts w:ascii="Arial" w:hAnsi="Arial" w:cs="Arial"/>
+                              <w:color w:val="595959" w:themeColor="text1" w:themeTint="A6"/>
+                              <w:sz w:val="20"/>
+                              <w:szCs w:val="20"/>
+                            </w:rPr>
+                            <w:t xml:space="preserve"> Pablo Quintero </w:t>
+                          </w:r>
+                          <w:r>
+                            <w:rPr>
+                              <w:rFonts w:ascii="Arial" w:hAnsi="Arial" w:cs="Arial"/>
+                              <w:color w:val="595959" w:themeColor="text1" w:themeTint="A6"/>
+                              <w:sz w:val="20"/>
+                              <w:szCs w:val="20"/>
+                            </w:rPr>
+                            <w:t>Rivera</w:t>
                           </w:r>
                         </w:p>
                         <w:p>
@@ -1117,14 +1143,16 @@
             <w:br w:type="page"/>
           </w:r>
         </w:p>
-        <w:bookmarkStart w:id="0" w:name="_GoBack" w:displacedByCustomXml="next"/>
-        <w:bookmarkEnd w:id="0" w:displacedByCustomXml="next"/>
       </w:sdtContent>
     </w:sdt>
     <w:sdt>
       <w:sdtPr>
         <w:rPr>
-          <w:lang w:val="es-ES"/>
+          <w:rFonts w:asciiTheme="minorHAnsi" w:eastAsiaTheme="minorHAnsi" w:hAnsiTheme="minorHAnsi" w:cstheme="minorBidi"/>
+          <w:color w:val="auto"/>
+          <w:sz w:val="22"/>
+          <w:szCs w:val="22"/>
+          <w:lang w:val="es-ES" w:eastAsia="en-US"/>
         </w:rPr>
         <w:id w:val="240688978"/>
         <w:docPartObj>
@@ -1134,13 +1162,8 @@
       </w:sdtPr>
       <w:sdtEndPr>
         <w:rPr>
-          <w:rFonts w:asciiTheme="minorHAnsi" w:eastAsiaTheme="minorHAnsi" w:hAnsiTheme="minorHAnsi" w:cstheme="minorBidi"/>
           <w:b/>
           <w:bCs/>
-          <w:color w:val="auto"/>
-          <w:sz w:val="22"/>
-          <w:szCs w:val="22"/>
-          <w:lang w:eastAsia="en-US"/>
         </w:rPr>
       </w:sdtEndPr>
       <w:sdtContent>
@@ -1913,7 +1936,7 @@
           <w:szCs w:val="22"/>
         </w:rPr>
       </w:pPr>
-      <w:bookmarkStart w:id="1" w:name="_Toc241594184"/>
+      <w:bookmarkStart w:id="0" w:name="_Toc241594184"/>
       <w:r>
         <w:rPr>
           <w:rFonts w:ascii="Arial" w:hAnsi="Arial" w:cs="Arial"/>
@@ -1925,7 +1948,7 @@
         <w:lastRenderedPageBreak/>
         <w:t>Resumen Ejecutivo</w:t>
       </w:r>
-      <w:bookmarkEnd w:id="1"/>
+      <w:bookmarkEnd w:id="0"/>
     </w:p>
     <w:p/>
     <w:p>
@@ -1971,17 +1994,8 @@
           <w:rFonts w:ascii="Arial" w:hAnsi="Arial" w:cs="Arial"/>
           <w:i/>
         </w:rPr>
-        <w:t xml:space="preserve"> </w:t>
-      </w:r>
-      <w:proofErr w:type="spellStart"/>
-      <w:r>
-        <w:rPr>
-          <w:rFonts w:ascii="Arial" w:hAnsi="Arial" w:cs="Arial"/>
-          <w:i/>
-        </w:rPr>
-        <w:t>Put</w:t>
-      </w:r>
-      <w:proofErr w:type="spellEnd"/>
+        <w:t xml:space="preserve"> Put</w:t>
+      </w:r>
       <w:r>
         <w:rPr>
           <w:rFonts w:ascii="Arial" w:hAnsi="Arial" w:cs="Arial"/>
@@ -2111,7 +2125,7 @@
           <w:szCs w:val="22"/>
         </w:rPr>
       </w:pPr>
-      <w:bookmarkStart w:id="2" w:name="_Toc241594185"/>
+      <w:bookmarkStart w:id="1" w:name="_Toc241594185"/>
       <w:r>
         <w:rPr>
           <w:rFonts w:ascii="Arial" w:hAnsi="Arial" w:cs="Arial"/>
@@ -2122,7 +2136,7 @@
         </w:rPr>
         <w:t>Fuentes y preparación de los datos</w:t>
       </w:r>
-      <w:bookmarkEnd w:id="2"/>
+      <w:bookmarkEnd w:id="1"/>
     </w:p>
     <w:p/>
     <w:p>
@@ -2202,6 +2216,7 @@
             <w:docPart w:val="DefaultPlaceholder_-1854013440"/>
           </w:placeholder>
         </w:sdtPr>
+        <w:sdtEndPr/>
         <w:sdtContent>
           <w:r>
             <w:rPr>
@@ -2359,6 +2374,7 @@
             <w:docPart w:val="DefaultPlaceholder_-1854013440"/>
           </w:placeholder>
         </w:sdtPr>
+        <w:sdtEndPr/>
         <w:sdtContent>
           <w:r>
             <w:rPr>
@@ -2398,7 +2414,7 @@
           <w:szCs w:val="22"/>
         </w:rPr>
       </w:pPr>
-      <w:bookmarkStart w:id="3" w:name="_Toc241594186"/>
+      <w:bookmarkStart w:id="2" w:name="_Toc241594186"/>
       <w:r>
         <w:rPr>
           <w:rFonts w:ascii="Arial" w:hAnsi="Arial" w:cs="Arial"/>
@@ -2409,7 +2425,7 @@
         </w:rPr>
         <w:t>Construcción del portafolio media-varianza</w:t>
       </w:r>
-      <w:bookmarkEnd w:id="3"/>
+      <w:bookmarkEnd w:id="2"/>
     </w:p>
     <w:p>
       <w:pPr>
@@ -3162,31 +3178,7 @@
         <w:rPr>
           <w:rFonts w:ascii="Arial" w:hAnsi="Arial" w:cs="Arial"/>
         </w:rPr>
-        <w:t>Los resultados muestran que el portafolio de máxima relación Sharpe obtiene un mayor retorno esperado, de 22,95%, frente al 19,33% de la mínima varianza</w:t>
-      </w:r>
-      <w:r>
-        <w:rPr>
-          <w:rFonts w:ascii="Arial" w:hAnsi="Arial" w:cs="Arial"/>
-        </w:rPr>
-        <w:t>, s</w:t>
-      </w:r>
-      <w:r>
-        <w:rPr>
-          <w:rFonts w:ascii="Arial" w:hAnsi="Arial" w:cs="Arial"/>
-        </w:rPr>
-        <w:t>in embargo, este mayor retorno está acompañado por una volatilidad de 21,21%, y una concentración del 67,30% del riesgo en un solo activo</w:t>
-      </w:r>
-      <w:r>
-        <w:rPr>
-          <w:rFonts w:ascii="Arial" w:hAnsi="Arial" w:cs="Arial"/>
-        </w:rPr>
-        <w:t xml:space="preserve"> (LLY), c</w:t>
-      </w:r>
-      <w:r>
-        <w:rPr>
-          <w:rFonts w:ascii="Arial" w:hAnsi="Arial" w:cs="Arial"/>
-        </w:rPr>
-        <w:t>uando se elimina el límite máximo de participación, la concentración del riesgo aumenta hasta 85,71%.</w:t>
+        <w:t>Los resultados muestran que el portafolio de máxima relación Sharpe obtiene un mayor retorno esperado, de 22,95%, frente al 19,33% de la mínima varianza, sin embargo, este mayor retorno está acompañado por una volatilidad de 21,21%, y una concentración del 67,30% del riesgo en un solo activo (LLY), cuando se elimina el límite máximo de participación, la concentración del riesgo aumenta hasta 85,71%.</w:t>
       </w:r>
     </w:p>
     <w:p>
@@ -3201,19 +3193,7 @@
         <w:rPr>
           <w:rFonts w:ascii="Arial" w:hAnsi="Arial" w:cs="Arial"/>
         </w:rPr>
-        <w:t>La mínima varianza presenta una volatilidad de 19,15%, la menor entre las alternativas evaluadas, y reduce la máxima contribución individual al riesgo hasta 40,59%</w:t>
-      </w:r>
-      <w:r>
-        <w:rPr>
-          <w:rFonts w:ascii="Arial" w:hAnsi="Arial" w:cs="Arial"/>
-        </w:rPr>
-        <w:t xml:space="preserve">, comparado </w:t>
-      </w:r>
-      <w:r>
-        <w:rPr>
-          <w:rFonts w:ascii="Arial" w:hAnsi="Arial" w:cs="Arial"/>
-        </w:rPr>
-        <w:t>al máximo Sharpe, esto representa una reducción de 2,06 puntos porcentuales de volatilidad y de 26,71 puntos porcentuales en la máxima concentración del riesgo, a cambio de un menor retorno esperado.</w:t>
+        <w:t>La mínima varianza presenta una volatilidad de 19,15%, la menor entre las alternativas evaluadas, y reduce la máxima contribución individual al riesgo hasta 40,59%, comparado al máximo Sharpe, esto representa una reducción de 2,06 puntos porcentuales de volatilidad y de 26,71 puntos porcentuales en la máxima concentración del riesgo, a cambio de un menor retorno esperado.</w:t>
       </w:r>
     </w:p>
     <w:p>
@@ -3228,25 +3208,7 @@
         <w:rPr>
           <w:rFonts w:ascii="Arial" w:hAnsi="Arial" w:cs="Arial"/>
         </w:rPr>
-        <w:t>La</w:t>
-      </w:r>
-      <w:r>
-        <w:rPr>
-          <w:rFonts w:ascii="Arial" w:hAnsi="Arial" w:cs="Arial"/>
-        </w:rPr>
-        <w:t xml:space="preserve"> selecci</w:t>
-      </w:r>
-      <w:r>
-        <w:rPr>
-          <w:rFonts w:ascii="Arial" w:hAnsi="Arial" w:cs="Arial"/>
-        </w:rPr>
-        <w:t xml:space="preserve">ón de </w:t>
-      </w:r>
-      <w:r>
-        <w:rPr>
-          <w:rFonts w:ascii="Arial" w:hAnsi="Arial" w:cs="Arial"/>
-        </w:rPr>
-        <w:t xml:space="preserve">la mínima varianza como criterio para </w:t>
+        <w:t xml:space="preserve">La selección de la mínima varianza como criterio para </w:t>
       </w:r>
       <w:r>
         <w:rPr>
@@ -3284,7 +3246,7 @@
           <w:szCs w:val="22"/>
         </w:rPr>
       </w:pPr>
-      <w:bookmarkStart w:id="4" w:name="_Toc241594187"/>
+      <w:bookmarkStart w:id="3" w:name="_Toc241594187"/>
       <w:r>
         <w:rPr>
           <w:rFonts w:ascii="Arial" w:hAnsi="Arial" w:cs="Arial"/>
@@ -3295,7 +3257,7 @@
         </w:rPr>
         <w:t>Simulación y métricas de riesgo</w:t>
       </w:r>
-      <w:bookmarkEnd w:id="4"/>
+      <w:bookmarkEnd w:id="3"/>
     </w:p>
     <w:p>
       <w:pPr>
@@ -3321,19 +3283,7 @@
           <w:rFonts w:ascii="Arial" w:hAnsi="Arial" w:cs="Arial"/>
         </w:rPr>
         <w:lastRenderedPageBreak/>
-        <w:t>Se realizaron 10.000 simulaciones para el horizonte de dos años, utilizando MBG combinado con GARCH-t</w:t>
-      </w:r>
-      <w:r>
-        <w:rPr>
-          <w:rFonts w:ascii="Arial" w:hAnsi="Arial" w:cs="Arial"/>
-        </w:rPr>
-        <w:t xml:space="preserve"> obteniendo que l</w:t>
-      </w:r>
-      <w:r>
-        <w:rPr>
-          <w:rFonts w:ascii="Arial" w:hAnsi="Arial" w:cs="Arial"/>
-        </w:rPr>
-        <w:t>a mediana del valor final fue de USD 15,50 millones, equivalente a un crecimiento de 55,0% frente al capital inicial</w:t>
+        <w:t>Se realizaron 10.000 simulaciones para el horizonte de dos años, utilizando MBG combinado con GARCH-t obteniendo que la mediana del valor final fue de USD 15,50 millones, equivalente a un crecimiento de 55,0% frente al capital inicial</w:t>
       </w:r>
       <w:r>
         <w:rPr>
@@ -3420,7 +3370,7 @@
           <w:szCs w:val="22"/>
         </w:rPr>
       </w:pPr>
-      <w:bookmarkStart w:id="5" w:name="_Toc241594188"/>
+      <w:bookmarkStart w:id="4" w:name="_Toc241594188"/>
       <w:r>
         <w:rPr>
           <w:rFonts w:ascii="Arial" w:hAnsi="Arial" w:cs="Arial"/>
@@ -3431,7 +3381,7 @@
         </w:rPr>
         <w:t>Selección de opciones y criterios de liquidez</w:t>
       </w:r>
-      <w:bookmarkEnd w:id="5"/>
+      <w:bookmarkEnd w:id="4"/>
     </w:p>
     <w:p>
       <w:pPr>
@@ -4379,7 +4329,7 @@
           <w:szCs w:val="22"/>
         </w:rPr>
       </w:pPr>
-      <w:bookmarkStart w:id="6" w:name="_Toc241594189"/>
+      <w:bookmarkStart w:id="5" w:name="_Toc241594189"/>
       <w:r>
         <w:rPr>
           <w:rFonts w:ascii="Arial" w:hAnsi="Arial" w:cs="Arial"/>
@@ -4390,7 +4340,7 @@
         </w:rPr>
         <w:t>Valoración binomial europea y americana</w:t>
       </w:r>
-      <w:bookmarkEnd w:id="6"/>
+      <w:bookmarkEnd w:id="5"/>
     </w:p>
     <w:p/>
     <w:tbl>
@@ -5288,7 +5238,7 @@
           <w:szCs w:val="22"/>
         </w:rPr>
       </w:pPr>
-      <w:bookmarkStart w:id="7" w:name="_Toc241594190"/>
+      <w:bookmarkStart w:id="6" w:name="_Toc241594190"/>
       <w:r>
         <w:rPr>
           <w:rFonts w:ascii="Arial" w:hAnsi="Arial" w:cs="Arial"/>
@@ -5299,7 +5249,7 @@
         </w:rPr>
         <w:t>Diseño de coberturas</w:t>
       </w:r>
-      <w:bookmarkEnd w:id="7"/>
+      <w:bookmarkEnd w:id="6"/>
     </w:p>
     <w:p/>
     <w:p>
@@ -5555,19 +5505,8 @@
                 <w:bCs/>
                 <w:lang w:eastAsia="es-CO"/>
               </w:rPr>
-              <w:t xml:space="preserve"> </w:t>
-            </w:r>
-            <w:proofErr w:type="spellStart"/>
-            <w:r>
-              <w:rPr>
-                <w:rFonts w:ascii="Arial" w:eastAsia="Times New Roman" w:hAnsi="Arial" w:cs="Arial"/>
-                <w:b/>
-                <w:bCs/>
-                <w:lang w:eastAsia="es-CO"/>
-              </w:rPr>
-              <w:t>Put</w:t>
-            </w:r>
-            <w:proofErr w:type="spellEnd"/>
+              <w:t xml:space="preserve"> Put</w:t>
+            </w:r>
           </w:p>
         </w:tc>
         <w:tc>
@@ -5849,59 +5788,30 @@
                 <w:bCs/>
                 <w:lang w:eastAsia="es-CO"/>
               </w:rPr>
-              <w:t xml:space="preserve">Bear </w:t>
-            </w:r>
-            <w:proofErr w:type="spellStart"/>
-            <w:r>
-              <w:rPr>
-                <w:rFonts w:ascii="Arial" w:eastAsia="Times New Roman" w:hAnsi="Arial" w:cs="Arial"/>
-                <w:b/>
-                <w:bCs/>
-                <w:lang w:eastAsia="es-CO"/>
-              </w:rPr>
-              <w:t>Put</w:t>
-            </w:r>
-            <w:proofErr w:type="spellEnd"/>
-            <w:r>
-              <w:rPr>
-                <w:rFonts w:ascii="Arial" w:eastAsia="Times New Roman" w:hAnsi="Arial" w:cs="Arial"/>
-                <w:b/>
-                <w:bCs/>
-                <w:lang w:eastAsia="es-CO"/>
-              </w:rPr>
-              <w:t xml:space="preserve"> Spread</w:t>
-            </w:r>
-          </w:p>
-        </w:tc>
-        <w:tc>
-          <w:tcPr>
-            <w:tcW w:w="0" w:type="auto"/>
-            <w:vAlign w:val="center"/>
-            <w:hideMark/>
-          </w:tcPr>
-          <w:p>
-            <w:pPr>
-              <w:spacing w:after="0" w:line="240" w:lineRule="auto"/>
-              <w:rPr>
-                <w:rFonts w:ascii="Arial" w:eastAsia="Times New Roman" w:hAnsi="Arial" w:cs="Arial"/>
-                <w:lang w:eastAsia="es-CO"/>
-              </w:rPr>
-            </w:pPr>
-            <w:proofErr w:type="spellStart"/>
-            <w:r>
-              <w:rPr>
-                <w:rFonts w:ascii="Arial" w:eastAsia="Times New Roman" w:hAnsi="Arial" w:cs="Arial"/>
-                <w:lang w:eastAsia="es-CO"/>
-              </w:rPr>
-              <w:t>Put</w:t>
-            </w:r>
-            <w:proofErr w:type="spellEnd"/>
-            <w:r>
-              <w:rPr>
-                <w:rFonts w:ascii="Arial" w:eastAsia="Times New Roman" w:hAnsi="Arial" w:cs="Arial"/>
-                <w:lang w:eastAsia="es-CO"/>
-              </w:rPr>
-              <w:t xml:space="preserve"> comprada − </w:t>
+              <w:t>Bear Put Spread</w:t>
+            </w:r>
+          </w:p>
+        </w:tc>
+        <w:tc>
+          <w:tcPr>
+            <w:tcW w:w="0" w:type="auto"/>
+            <w:vAlign w:val="center"/>
+            <w:hideMark/>
+          </w:tcPr>
+          <w:p>
+            <w:pPr>
+              <w:spacing w:after="0" w:line="240" w:lineRule="auto"/>
+              <w:rPr>
+                <w:rFonts w:ascii="Arial" w:eastAsia="Times New Roman" w:hAnsi="Arial" w:cs="Arial"/>
+                <w:lang w:eastAsia="es-CO"/>
+              </w:rPr>
+            </w:pPr>
+            <w:r>
+              <w:rPr>
+                <w:rFonts w:ascii="Arial" w:eastAsia="Times New Roman" w:hAnsi="Arial" w:cs="Arial"/>
+                <w:lang w:eastAsia="es-CO"/>
+              </w:rPr>
+              <w:t xml:space="preserve">Put comprada − </w:t>
             </w:r>
             <w:proofErr w:type="spellStart"/>
             <w:r>
@@ -6122,7 +6032,7 @@
           <w:szCs w:val="22"/>
         </w:rPr>
       </w:pPr>
-      <w:bookmarkStart w:id="8" w:name="_Toc241594191"/>
+      <w:bookmarkStart w:id="7" w:name="_Toc241594191"/>
       <w:r>
         <w:rPr>
           <w:rFonts w:ascii="Arial" w:hAnsi="Arial" w:cs="Arial"/>
@@ -6133,7 +6043,7 @@
         </w:rPr>
         <w:t>Seguimiento trimestral y comparación cubierto/no cubierto</w:t>
       </w:r>
-      <w:bookmarkEnd w:id="8"/>
+      <w:bookmarkEnd w:id="7"/>
     </w:p>
     <w:p>
       <w:pPr>
@@ -6292,7 +6202,7 @@
           <w:szCs w:val="22"/>
         </w:rPr>
       </w:pPr>
-      <w:bookmarkStart w:id="9" w:name="_Toc241594192"/>
+      <w:bookmarkStart w:id="8" w:name="_Toc241594192"/>
       <w:r>
         <w:rPr>
           <w:rFonts w:ascii="Arial" w:hAnsi="Arial" w:cs="Arial"/>
@@ -6303,7 +6213,7 @@
         </w:rPr>
         <w:t>Conclusiones, limitaciones y recomendación final</w:t>
       </w:r>
-      <w:bookmarkEnd w:id="9"/>
+      <w:bookmarkEnd w:id="8"/>
     </w:p>
     <w:p/>
     <w:p>
@@ -6637,7 +6547,7 @@
 </file>
 
 <file path=word/styles.xml><?xml version="1.0" encoding="utf-8"?>
-<w:styles xmlns:mc="http://schemas.openxmlformats.org/markup-compatibility/2006" xmlns:r="http://schemas.openxmlformats.org/officeDocument/2006/relationships" xmlns:w="http://schemas.openxmlformats.org/wordprocessingml/2006/main" xmlns:w14="http://schemas.microsoft.com/office/word/2010/wordml" xmlns:w15="http://schemas.microsoft.com/office/word/2012/wordml" xmlns:w16cid="http://schemas.microsoft.com/office/word/2016/wordml/cid" xmlns:w16se="http://schemas.microsoft.com/office/word/2015/wordml/symex" mc:Ignorable="w14 w15 w16se w16cid">
+<w:styles xmlns:mc="http://schemas.openxmlformats.org/markup-compatibility/2006" xmlns:r="http://schemas.openxmlformats.org/officeDocument/2006/relationships" xmlns:w="http://schemas.openxmlformats.org/wordprocessingml/2006/main" xmlns:w14="http://schemas.microsoft.com/office/word/2010/wordml" xmlns:w15="http://schemas.microsoft.com/office/word/2012/wordml" xmlns:w16cex="http://schemas.microsoft.com/office/word/2018/wordml/cex" xmlns:w16cid="http://schemas.microsoft.com/office/word/2016/wordml/cid" xmlns:w16="http://schemas.microsoft.com/office/word/2018/wordml" xmlns:w16du="http://schemas.microsoft.com/office/word/2023/wordml/word16du" xmlns:w16sdtdh="http://schemas.microsoft.com/office/word/2020/wordml/sdtdatahash" xmlns:w16sdtfl="http://schemas.microsoft.com/office/word/2024/wordml/sdtformatlock" xmlns:w16se="http://schemas.microsoft.com/office/word/2015/wordml/symex" mc:Ignorable="w14 w15 w16se w16cid w16 w16cex w16sdtdh w16sdtfl w16du">
   <w:docDefaults>
     <w:rPrDefault>
       <w:rPr>
@@ -6653,7 +6563,7 @@
       </w:pPr>
     </w:pPrDefault>
   </w:docDefaults>
-  <w:latentStyles w:defLockedState="0" w:defUIPriority="99" w:defSemiHidden="0" w:defUnhideWhenUsed="0" w:defQFormat="0" w:count="375">
+  <w:latentStyles w:defLockedState="0" w:defUIPriority="99" w:defSemiHidden="0" w:defUnhideWhenUsed="0" w:defQFormat="0" w:count="376">
     <w:lsdException w:name="Normal" w:uiPriority="0" w:qFormat="1"/>
     <w:lsdException w:name="heading 1" w:uiPriority="9" w:qFormat="1"/>
     <w:lsdException w:name="heading 2" w:semiHidden="1" w:uiPriority="9" w:unhideWhenUsed="1" w:qFormat="1"/>
@@ -7029,6 +6939,7 @@
     <w:lsdException w:name="Smart Hyperlink" w:semiHidden="1" w:unhideWhenUsed="1"/>
     <w:lsdException w:name="Hashtag" w:semiHidden="1" w:unhideWhenUsed="1"/>
     <w:lsdException w:name="Unresolved Mention" w:semiHidden="1" w:unhideWhenUsed="1"/>
+    <w:lsdException w:name="Smart Link" w:semiHidden="1" w:unhideWhenUsed="1"/>
   </w:latentStyles>
   <w:style w:type="paragraph" w:default="1" w:styleId="Normal">
     <w:name w:val="Normal"/>
@@ -7139,7 +7050,7 @@
       <w:color w:val="808080"/>
     </w:rPr>
   </w:style>
-  <w:style w:type="character" w:styleId="Textoennegrita">
+  <w:style w:type="character" w:styleId="Fuerte">
     <w:name w:val="Strong"/>
     <w:basedOn w:val="Fuentedeprrafopredeter"/>
     <w:uiPriority w:val="22"/>
@@ -7222,7 +7133,7 @@
 </file>
 
 <file path=word/glossary/document.xml><?xml version="1.0" encoding="utf-8"?>
-<w:glossaryDocument xmlns:wpc="http://schemas.microsoft.com/office/word/2010/wordprocessingCanvas" xmlns:cx="http://schemas.microsoft.com/office/drawing/2014/chartex" xmlns:cx1="http://schemas.microsoft.com/office/drawing/2015/9/8/chartex" xmlns:cx2="http://schemas.microsoft.com/office/drawing/2015/10/21/chartex" xmlns:cx3="http://schemas.microsoft.com/office/drawing/2016/5/9/chartex" xmlns:cx4="http://schemas.microsoft.com/office/drawing/2016/5/10/chartex" xmlns:cx5="http://schemas.microsoft.com/office/drawing/2016/5/11/chartex" xmlns:cx6="http://schemas.microsoft.com/office/drawing/2016/5/12/chartex" xmlns:cx7="http://schemas.microsoft.com/office/drawing/2016/5/13/chartex" xmlns:cx8="http://schemas.microsoft.com/office/drawing/2016/5/14/chartex" xmlns:mc="http://schemas.openxmlformats.org/markup-compatibility/2006" xmlns:aink="http://schemas.microsoft.com/office/drawing/2016/ink" xmlns:am3d="http://schemas.microsoft.com/office/drawing/2017/model3d" xmlns:o="urn:schemas-microsoft-com:office:office" xmlns:r="http://schemas.openxmlformats.org/officeDocument/2006/relationships" xmlns:m="http://schemas.openxmlformats.org/officeDocument/2006/math" xmlns:v="urn:schemas-microsoft-com:vml" xmlns:wp14="http://schemas.microsoft.com/office/word/2010/wordprocessingDrawing" xmlns:wp="http://schemas.openxmlformats.org/drawingml/2006/wordprocessingDrawing" xmlns:w10="urn:schemas-microsoft-com:office:word" xmlns:w="http://schemas.openxmlformats.org/wordprocessingml/2006/main" xmlns:w14="http://schemas.microsoft.com/office/word/2010/wordml" xmlns:w15="http://schemas.microsoft.com/office/word/2012/wordml" xmlns:w16cid="http://schemas.microsoft.com/office/word/2016/wordml/cid" xmlns:w16se="http://schemas.microsoft.com/office/word/2015/wordml/symex" xmlns:wpg="http://schemas.microsoft.com/office/word/2010/wordprocessingGroup" xmlns:wpi="http://schemas.microsoft.com/office/word/2010/wordprocessingInk" xmlns:wne="http://schemas.microsoft.com/office/word/2006/wordml" xmlns:wps="http://schemas.microsoft.com/office/word/2010/wordprocessingShape" mc:Ignorable="w14 w15 w16se w16cid wp14">
+<w:glossaryDocument xmlns:wpc="http://schemas.microsoft.com/office/word/2010/wordprocessingCanvas" xmlns:cx="http://schemas.microsoft.com/office/drawing/2014/chartex" xmlns:cx1="http://schemas.microsoft.com/office/drawing/2015/9/8/chartex" xmlns:cx2="http://schemas.microsoft.com/office/drawing/2015/10/21/chartex" xmlns:cx3="http://schemas.microsoft.com/office/drawing/2016/5/9/chartex" xmlns:cx4="http://schemas.microsoft.com/office/drawing/2016/5/10/chartex" xmlns:cx5="http://schemas.microsoft.com/office/drawing/2016/5/11/chartex" xmlns:cx6="http://schemas.microsoft.com/office/drawing/2016/5/12/chartex" xmlns:cx7="http://schemas.microsoft.com/office/drawing/2016/5/13/chartex" xmlns:cx8="http://schemas.microsoft.com/office/drawing/2016/5/14/chartex" xmlns:mc="http://schemas.openxmlformats.org/markup-compatibility/2006" xmlns:aink="http://schemas.microsoft.com/office/drawing/2016/ink" xmlns:am3d="http://schemas.microsoft.com/office/drawing/2017/model3d" xmlns:o="urn:schemas-microsoft-com:office:office" xmlns:oel="http://schemas.microsoft.com/office/2019/extlst" xmlns:r="http://schemas.openxmlformats.org/officeDocument/2006/relationships" xmlns:m="http://schemas.openxmlformats.org/officeDocument/2006/math" xmlns:v="urn:schemas-microsoft-com:vml" xmlns:wp14="http://schemas.microsoft.com/office/word/2010/wordprocessingDrawing" xmlns:wp="http://schemas.openxmlformats.org/drawingml/2006/wordprocessingDrawing" xmlns:w10="urn:schemas-microsoft-com:office:word" xmlns:w="http://schemas.openxmlformats.org/wordprocessingml/2006/main" xmlns:w14="http://schemas.microsoft.com/office/word/2010/wordml" xmlns:w15="http://schemas.microsoft.com/office/word/2012/wordml" xmlns:w16cex="http://schemas.microsoft.com/office/word/2018/wordml/cex" xmlns:w16cid="http://schemas.microsoft.com/office/word/2016/wordml/cid" xmlns:w16="http://schemas.microsoft.com/office/word/2018/wordml" xmlns:w16du="http://schemas.microsoft.com/office/word/2023/wordml/word16du" xmlns:w16sdtdh="http://schemas.microsoft.com/office/word/2020/wordml/sdtdatahash" xmlns:w16sdtfl="http://schemas.microsoft.com/office/word/2024/wordml/sdtformatlock" xmlns:w16se="http://schemas.microsoft.com/office/word/2015/wordml/symex" xmlns:wpg="http://schemas.microsoft.com/office/word/2010/wordprocessingGroup" xmlns:wpi="http://schemas.microsoft.com/office/word/2010/wordprocessingInk" xmlns:wne="http://schemas.microsoft.com/office/word/2006/wordml" xmlns:wps="http://schemas.microsoft.com/office/word/2010/wordprocessingShape" mc:Ignorable="w14 w15 w16se w16cid w16 w16cex w16sdtdh w16sdtfl w16du wp14">
   <w:docParts>
     <w:docPart>
       <w:docPartPr>
@@ -7255,7 +7166,7 @@
 </file>
 
 <file path=word/glossary/fontTable.xml><?xml version="1.0" encoding="utf-8"?>
-<w:fonts xmlns:mc="http://schemas.openxmlformats.org/markup-compatibility/2006" xmlns:r="http://schemas.openxmlformats.org/officeDocument/2006/relationships" xmlns:w="http://schemas.openxmlformats.org/wordprocessingml/2006/main" xmlns:w14="http://schemas.microsoft.com/office/word/2010/wordml" xmlns:w15="http://schemas.microsoft.com/office/word/2012/wordml" xmlns:w16cid="http://schemas.microsoft.com/office/word/2016/wordml/cid" xmlns:w16se="http://schemas.microsoft.com/office/word/2015/wordml/symex" mc:Ignorable="w14 w15 w16se w16cid">
+<w:fonts xmlns:mc="http://schemas.openxmlformats.org/markup-compatibility/2006" xmlns:r="http://schemas.openxmlformats.org/officeDocument/2006/relationships" xmlns:w="http://schemas.openxmlformats.org/wordprocessingml/2006/main" xmlns:w14="http://schemas.microsoft.com/office/word/2010/wordml" xmlns:w15="http://schemas.microsoft.com/office/word/2012/wordml" xmlns:w16cex="http://schemas.microsoft.com/office/word/2018/wordml/cex" xmlns:w16cid="http://schemas.microsoft.com/office/word/2016/wordml/cid" xmlns:w16="http://schemas.microsoft.com/office/word/2018/wordml" xmlns:w16du="http://schemas.microsoft.com/office/word/2023/wordml/word16du" xmlns:w16sdtdh="http://schemas.microsoft.com/office/word/2020/wordml/sdtdatahash" xmlns:w16sdtfl="http://schemas.microsoft.com/office/word/2024/wordml/sdtformatlock" xmlns:w16se="http://schemas.microsoft.com/office/word/2015/wordml/symex" mc:Ignorable="w14 w15 w16se w16cid w16 w16cex w16sdtdh w16sdtfl w16du">
   <w:font w:name="Calibri">
     <w:panose1 w:val="020F0502020204030204"/>
     <w:charset w:val="00"/>
@@ -7291,11 +7202,23 @@
     <w:pitch w:val="variable"/>
     <w:sig w:usb0="E00006FF" w:usb1="420024FF" w:usb2="02000000" w:usb3="00000000" w:csb0="0000019F" w:csb1="00000000"/>
   </w:font>
+  <w:font w:name="Aptos">
+    <w:charset w:val="00"/>
+    <w:family w:val="swiss"/>
+    <w:pitch w:val="variable"/>
+    <w:sig w:usb0="20000287" w:usb1="00000003" w:usb2="00000000" w:usb3="00000000" w:csb0="0000019F" w:csb1="00000000"/>
+  </w:font>
+  <w:font w:name="Aptos Display">
+    <w:charset w:val="00"/>
+    <w:family w:val="swiss"/>
+    <w:pitch w:val="variable"/>
+    <w:sig w:usb0="20000287" w:usb1="00000003" w:usb2="00000000" w:usb3="00000000" w:csb0="0000019F" w:csb1="00000000"/>
+  </w:font>
 </w:fonts>
 </file>
 
 <file path=word/glossary/settings.xml><?xml version="1.0" encoding="utf-8"?>
-<w:settings xmlns:mc="http://schemas.openxmlformats.org/markup-compatibility/2006" xmlns:o="urn:schemas-microsoft-com:office:office" xmlns:r="http://schemas.openxmlformats.org/officeDocument/2006/relationships" xmlns:m="http://schemas.openxmlformats.org/officeDocument/2006/math" xmlns:v="urn:schemas-microsoft-com:vml" xmlns:w10="urn:schemas-microsoft-com:office:word" xmlns:w="http://schemas.openxmlformats.org/wordprocessingml/2006/main" xmlns:w14="http://schemas.microsoft.com/office/word/2010/wordml" xmlns:w15="http://schemas.microsoft.com/office/word/2012/wordml" xmlns:w16cid="http://schemas.microsoft.com/office/word/2016/wordml/cid" xmlns:w16se="http://schemas.microsoft.com/office/word/2015/wordml/symex" xmlns:sl="http://schemas.openxmlformats.org/schemaLibrary/2006/main" mc:Ignorable="w14 w15 w16se w16cid">
+<w:settings xmlns:mc="http://schemas.openxmlformats.org/markup-compatibility/2006" xmlns:o="urn:schemas-microsoft-com:office:office" xmlns:r="http://schemas.openxmlformats.org/officeDocument/2006/relationships" xmlns:m="http://schemas.openxmlformats.org/officeDocument/2006/math" xmlns:v="urn:schemas-microsoft-com:vml" xmlns:w10="urn:schemas-microsoft-com:office:word" xmlns:w="http://schemas.openxmlformats.org/wordprocessingml/2006/main" xmlns:w14="http://schemas.microsoft.com/office/word/2010/wordml" xmlns:w15="http://schemas.microsoft.com/office/word/2012/wordml" xmlns:w16cex="http://schemas.microsoft.com/office/word/2018/wordml/cex" xmlns:w16cid="http://schemas.microsoft.com/office/word/2016/wordml/cid" xmlns:w16="http://schemas.microsoft.com/office/word/2018/wordml" xmlns:w16du="http://schemas.microsoft.com/office/word/2023/wordml/word16du" xmlns:w16sdtdh="http://schemas.microsoft.com/office/word/2020/wordml/sdtdatahash" xmlns:w16sdtfl="http://schemas.microsoft.com/office/word/2024/wordml/sdtformatlock" xmlns:w16se="http://schemas.microsoft.com/office/word/2015/wordml/symex" xmlns:sl="http://schemas.openxmlformats.org/schemaLibrary/2006/main" mc:Ignorable="w14 w15 w16se w16cid w16 w16cex w16sdtdh w16sdtfl w16du">
   <w:view w:val="normal"/>
   <w:defaultTabStop w:val="708"/>
   <w:hyphenationZone w:val="425"/>
@@ -7311,7 +7234,10 @@
   </w:compat>
   <w:rsids>
     <w:rsidRoot w:val="00931BF3"/>
+    <w:rsid w:val="004F45AA"/>
     <w:rsid w:val="00931BF3"/>
+    <w:rsid w:val="009F4C54"/>
+    <w:rsid w:val="00A30AEE"/>
   </w:rsids>
   <m:mathPr>
     <m:mathFont m:val="Cambria Math"/>
@@ -7328,14 +7254,14 @@
   </m:mathPr>
   <w:themeFontLang w:val="es-CO"/>
   <w:clrSchemeMapping w:bg1="light1" w:t1="dark1" w:bg2="light2" w:t2="dark2" w:accent1="accent1" w:accent2="accent2" w:accent3="accent3" w:accent4="accent4" w:accent5="accent5" w:accent6="accent6" w:hyperlink="hyperlink" w:followedHyperlink="followedHyperlink"/>
-  <w:decimalSymbol w:val=","/>
-  <w:listSeparator w:val=";"/>
+  <w:decimalSymbol w:val="."/>
+  <w:listSeparator w:val=","/>
   <w15:chartTrackingRefBased/>
 </w:settings>
 </file>
 
 <file path=word/glossary/styles.xml><?xml version="1.0" encoding="utf-8"?>
-<w:styles xmlns:mc="http://schemas.openxmlformats.org/markup-compatibility/2006" xmlns:r="http://schemas.openxmlformats.org/officeDocument/2006/relationships" xmlns:w="http://schemas.openxmlformats.org/wordprocessingml/2006/main" xmlns:w14="http://schemas.microsoft.com/office/word/2010/wordml" xmlns:w15="http://schemas.microsoft.com/office/word/2012/wordml" xmlns:w16cid="http://schemas.microsoft.com/office/word/2016/wordml/cid" xmlns:w16se="http://schemas.microsoft.com/office/word/2015/wordml/symex" mc:Ignorable="w14 w15 w16se w16cid">
+<w:styles xmlns:mc="http://schemas.openxmlformats.org/markup-compatibility/2006" xmlns:r="http://schemas.openxmlformats.org/officeDocument/2006/relationships" xmlns:w="http://schemas.openxmlformats.org/wordprocessingml/2006/main" xmlns:w14="http://schemas.microsoft.com/office/word/2010/wordml" xmlns:w15="http://schemas.microsoft.com/office/word/2012/wordml" xmlns:w16cex="http://schemas.microsoft.com/office/word/2018/wordml/cex" xmlns:w16cid="http://schemas.microsoft.com/office/word/2016/wordml/cid" xmlns:w16="http://schemas.microsoft.com/office/word/2018/wordml" xmlns:w16du="http://schemas.microsoft.com/office/word/2023/wordml/word16du" xmlns:w16sdtdh="http://schemas.microsoft.com/office/word/2020/wordml/sdtdatahash" xmlns:w16sdtfl="http://schemas.microsoft.com/office/word/2024/wordml/sdtformatlock" xmlns:w16se="http://schemas.microsoft.com/office/word/2015/wordml/symex" mc:Ignorable="w14 w15 w16se w16cid w16 w16cex w16sdtdh w16sdtfl w16du">
   <w:docDefaults>
     <w:rPrDefault>
       <w:rPr>
@@ -7351,7 +7277,7 @@
       </w:pPr>
     </w:pPrDefault>
   </w:docDefaults>
-  <w:latentStyles w:defLockedState="0" w:defUIPriority="99" w:defSemiHidden="0" w:defUnhideWhenUsed="0" w:defQFormat="0" w:count="375">
+  <w:latentStyles w:defLockedState="0" w:defUIPriority="99" w:defSemiHidden="0" w:defUnhideWhenUsed="0" w:defQFormat="0" w:count="376">
     <w:lsdException w:name="Normal" w:uiPriority="0" w:qFormat="1"/>
     <w:lsdException w:name="heading 1" w:uiPriority="9" w:qFormat="1"/>
     <w:lsdException w:name="heading 2" w:semiHidden="1" w:uiPriority="9" w:unhideWhenUsed="1" w:qFormat="1"/>
@@ -7727,6 +7653,7 @@
     <w:lsdException w:name="Smart Hyperlink" w:semiHidden="1" w:unhideWhenUsed="1"/>
     <w:lsdException w:name="Hashtag" w:semiHidden="1" w:unhideWhenUsed="1"/>
     <w:lsdException w:name="Unresolved Mention" w:semiHidden="1" w:unhideWhenUsed="1"/>
+    <w:lsdException w:name="Smart Link" w:semiHidden="1" w:unhideWhenUsed="1"/>
   </w:latentStyles>
   <w:style w:type="paragraph" w:default="1" w:styleId="Normal">
     <w:name w:val="Normal"/>
@@ -7773,7 +7700,7 @@
 </file>
 
 <file path=word/glossary/webSettings.xml><?xml version="1.0" encoding="utf-8"?>
-<w:webSettings xmlns:mc="http://schemas.openxmlformats.org/markup-compatibility/2006" xmlns:r="http://schemas.openxmlformats.org/officeDocument/2006/relationships" xmlns:w="http://schemas.openxmlformats.org/wordprocessingml/2006/main" xmlns:w14="http://schemas.microsoft.com/office/word/2010/wordml" xmlns:w15="http://schemas.microsoft.com/office/word/2012/wordml" xmlns:w16cid="http://schemas.microsoft.com/office/word/2016/wordml/cid" xmlns:w16se="http://schemas.microsoft.com/office/word/2015/wordml/symex" mc:Ignorable="w14 w15 w16se w16cid">
+<w:webSettings xmlns:mc="http://schemas.openxmlformats.org/markup-compatibility/2006" xmlns:r="http://schemas.openxmlformats.org/officeDocument/2006/relationships" xmlns:w="http://schemas.openxmlformats.org/wordprocessingml/2006/main" xmlns:w14="http://schemas.microsoft.com/office/word/2010/wordml" xmlns:w15="http://schemas.microsoft.com/office/word/2012/wordml" xmlns:w16cex="http://schemas.microsoft.com/office/word/2018/wordml/cex" xmlns:w16cid="http://schemas.microsoft.com/office/word/2016/wordml/cid" xmlns:w16="http://schemas.microsoft.com/office/word/2018/wordml" xmlns:w16du="http://schemas.microsoft.com/office/word/2023/wordml/word16du" xmlns:w16sdtdh="http://schemas.microsoft.com/office/word/2020/wordml/sdtdatahash" xmlns:w16sdtfl="http://schemas.microsoft.com/office/word/2024/wordml/sdtformatlock" xmlns:w16se="http://schemas.microsoft.com/office/word/2015/wordml/symex" mc:Ignorable="w14 w15 w16se w16cid w16 w16cex w16sdtdh w16sdtfl w16du">
   <w:optimizeForBrowser/>
   <w:allowPNG/>
 </w:webSettings>
@@ -8110,6 +8037,15 @@
 </file>
 
 <file path=customXml/item2.xml><?xml version="1.0" encoding="utf-8"?>
+<?mso-contentType ?>
+<FormTemplates xmlns="http://schemas.microsoft.com/sharepoint/v3/contenttype/forms">
+  <Display>DocumentLibraryForm</Display>
+  <Edit>DocumentLibraryForm</Edit>
+  <New>DocumentLibraryForm</New>
+</FormTemplates>
+</file>
+
+<file path=customXml/item3.xml><?xml version="1.0" encoding="utf-8"?>
 <ct:contentTypeSchema xmlns:ct="http://schemas.microsoft.com/office/2006/metadata/contentType" xmlns:ma="http://schemas.microsoft.com/office/2006/metadata/properties/metaAttributes" ct:_="" ma:_="" ma:contentTypeName="Documento" ma:contentTypeID="0x010100CB90674D8FB16342ADAE5FD2FEA45EFA" ma:contentTypeVersion="17" ma:contentTypeDescription="Crear nuevo documento." ma:contentTypeScope="" ma:versionID="e94d719363a75a7069b7dadc39f09f30">
   <xsd:schema xmlns:xsd="http://www.w3.org/2001/XMLSchema" xmlns:xs="http://www.w3.org/2001/XMLSchema" xmlns:p="http://schemas.microsoft.com/office/2006/metadata/properties" xmlns:ns3="3dd290e0-9f81-49ae-bc64-ff7b15fd3b53" xmlns:ns4="7c6fcce2-6bd9-47ed-a262-2036ba438394" targetNamespace="http://schemas.microsoft.com/office/2006/metadata/properties" ma:root="true" ma:fieldsID="5be251243f5218f4e00f488e4423d5d1" ns3:_="" ns4:_="">
     <xsd:import namespace="3dd290e0-9f81-49ae-bc64-ff7b15fd3b53"/>
@@ -8356,25 +8292,16 @@
 </ct:contentTypeSchema>
 </file>
 
-<file path=customXml/item3.xml><?xml version="1.0" encoding="utf-8"?>
-<?mso-contentType ?>
-<FormTemplates xmlns="http://schemas.microsoft.com/sharepoint/v3/contenttype/forms">
-  <Display>DocumentLibraryForm</Display>
-  <Edit>DocumentLibraryForm</Edit>
-  <New>DocumentLibraryForm</New>
-</FormTemplates>
+<file path=customXml/item4.xml><?xml version="1.0" encoding="utf-8"?>
+<b:Sources xmlns:b="http://schemas.openxmlformats.org/officeDocument/2006/bibliography" xmlns="http://schemas.openxmlformats.org/officeDocument/2006/bibliography" SelectedStyle="\APASixthEditionOfficeOnline.xsl" StyleName="APA" Version="6"/>
 </file>
 
-<file path=customXml/item4.xml><?xml version="1.0" encoding="utf-8"?>
+<file path=customXml/item5.xml><?xml version="1.0" encoding="utf-8"?>
 <p:properties xmlns:p="http://schemas.microsoft.com/office/2006/metadata/properties" xmlns:xsi="http://www.w3.org/2001/XMLSchema-instance" xmlns:pc="http://schemas.microsoft.com/office/infopath/2007/PartnerControls">
   <documentManagement>
     <_activity xmlns="3dd290e0-9f81-49ae-bc64-ff7b15fd3b53" xsi:nil="true"/>
   </documentManagement>
 </p:properties>
-</file>
-
-<file path=customXml/item5.xml><?xml version="1.0" encoding="utf-8"?>
-<b:Sources xmlns:b="http://schemas.openxmlformats.org/officeDocument/2006/bibliography" xmlns="http://schemas.openxmlformats.org/officeDocument/2006/bibliography" SelectedStyle="\APASixthEditionOfficeOnline.xsl" StyleName="APA" Version="6"/>
 </file>
 
 <file path=customXml/itemProps1.xml><?xml version="1.0" encoding="utf-8"?>
@@ -8386,6 +8313,14 @@
 </file>
 
 <file path=customXml/itemProps2.xml><?xml version="1.0" encoding="utf-8"?>
+<ds:datastoreItem xmlns:ds="http://schemas.openxmlformats.org/officeDocument/2006/customXml" ds:itemID="{F6C7B19F-7290-421D-AC23-318F3CD5457C}">
+  <ds:schemaRefs>
+    <ds:schemaRef ds:uri="http://schemas.microsoft.com/sharepoint/v3/contenttype/forms"/>
+  </ds:schemaRefs>
+</ds:datastoreItem>
+</file>
+
+<file path=customXml/itemProps3.xml><?xml version="1.0" encoding="utf-8"?>
 <ds:datastoreItem xmlns:ds="http://schemas.openxmlformats.org/officeDocument/2006/customXml" ds:itemID="{6A09FD9A-39C8-47E0-9043-56A9734A9BBC}">
   <ds:schemaRefs>
     <ds:schemaRef ds:uri="http://schemas.microsoft.com/office/2006/metadata/contentType"/>
@@ -8404,35 +8339,20 @@
 </ds:datastoreItem>
 </file>
 
-<file path=customXml/itemProps3.xml><?xml version="1.0" encoding="utf-8"?>
-<ds:datastoreItem xmlns:ds="http://schemas.openxmlformats.org/officeDocument/2006/customXml" ds:itemID="{F6C7B19F-7290-421D-AC23-318F3CD5457C}">
+<file path=customXml/itemProps4.xml><?xml version="1.0" encoding="utf-8"?>
+<ds:datastoreItem xmlns:ds="http://schemas.openxmlformats.org/officeDocument/2006/customXml" ds:itemID="{A917458B-048C-4328-B77A-F328FFE06827}">
   <ds:schemaRefs>
-    <ds:schemaRef ds:uri="http://schemas.microsoft.com/sharepoint/v3/contenttype/forms"/>
-  </ds:schemaRefs>
-</ds:datastoreItem>
-</file>
-
-<file path=customXml/itemProps4.xml><?xml version="1.0" encoding="utf-8"?>
-<ds:datastoreItem xmlns:ds="http://schemas.openxmlformats.org/officeDocument/2006/customXml" ds:itemID="{01D3D888-55D0-4A1C-8348-784666CE6436}">
-  <ds:schemaRefs>
-    <ds:schemaRef ds:uri="http://purl.org/dc/dcmitype/"/>
-    <ds:schemaRef ds:uri="http://schemas.microsoft.com/office/2006/documentManagement/types"/>
-    <ds:schemaRef ds:uri="http://purl.org/dc/terms/"/>
-    <ds:schemaRef ds:uri="http://purl.org/dc/elements/1.1/"/>
-    <ds:schemaRef ds:uri="http://www.w3.org/XML/1998/namespace"/>
-    <ds:schemaRef ds:uri="http://schemas.microsoft.com/office/infopath/2007/PartnerControls"/>
-    <ds:schemaRef ds:uri="3dd290e0-9f81-49ae-bc64-ff7b15fd3b53"/>
-    <ds:schemaRef ds:uri="http://schemas.openxmlformats.org/package/2006/metadata/core-properties"/>
-    <ds:schemaRef ds:uri="7c6fcce2-6bd9-47ed-a262-2036ba438394"/>
-    <ds:schemaRef ds:uri="http://schemas.microsoft.com/office/2006/metadata/properties"/>
+    <ds:schemaRef ds:uri="http://schemas.openxmlformats.org/officeDocument/2006/bibliography"/>
   </ds:schemaRefs>
 </ds:datastoreItem>
 </file>
 
 <file path=customXml/itemProps5.xml><?xml version="1.0" encoding="utf-8"?>
-<ds:datastoreItem xmlns:ds="http://schemas.openxmlformats.org/officeDocument/2006/customXml" ds:itemID="{A917458B-048C-4328-B77A-F328FFE06827}">
+<ds:datastoreItem xmlns:ds="http://schemas.openxmlformats.org/officeDocument/2006/customXml" ds:itemID="{01D3D888-55D0-4A1C-8348-784666CE6436}">
   <ds:schemaRefs>
-    <ds:schemaRef ds:uri="http://schemas.openxmlformats.org/officeDocument/2006/bibliography"/>
+    <ds:schemaRef ds:uri="http://schemas.microsoft.com/office/2006/metadata/properties"/>
+    <ds:schemaRef ds:uri="http://schemas.microsoft.com/office/infopath/2007/PartnerControls"/>
+    <ds:schemaRef ds:uri="3dd290e0-9f81-49ae-bc64-ff7b15fd3b53"/>
   </ds:schemaRefs>
 </ds:datastoreItem>
 </file>
</xml_diff>